<commit_message>
Update XML field reference and implementation notes documentation
Co-Authored-By: Claude Opus 4.6 <noreply@anthropic.com>
</commit_message>
<xml_diff>
--- a/docs/Diamond2_XML_Field_Reference_and_Implementation_Notes.docx
+++ b/docs/Diamond2_XML_Field_Reference_and_Implementation_Notes.docx
@@ -1,6 +1,6 @@
 
 <file path=word/document.xml><?xml version="1.0" encoding="utf-8"?>
-<w:document xmlns:o="urn:schemas-microsoft-com:office:office" xmlns:r="http://schemas.openxmlformats.org/officeDocument/2006/relationships" xmlns:v="urn:schemas-microsoft-com:vml" xmlns:w="http://schemas.openxmlformats.org/wordprocessingml/2006/main" xmlns:w10="urn:schemas-microsoft-com:office:word" xmlns:wp="http://schemas.openxmlformats.org/drawingml/2006/wordprocessingDrawing" xmlns:wps="http://schemas.microsoft.com/office/word/2010/wordprocessingShape" xmlns:wpg="http://schemas.microsoft.com/office/word/2010/wordprocessingGroup" xmlns:mc="http://schemas.openxmlformats.org/markup-compatibility/2006" xmlns:wp14="http://schemas.microsoft.com/office/word/2010/wordprocessingDrawing" xmlns:w14="http://schemas.microsoft.com/office/word/2010/wordml" mc:Ignorable="w14 wp14">
+<w:document xmlns:o="urn:schemas-microsoft-com:office:office" xmlns:r="http://schemas.openxmlformats.org/officeDocument/2006/relationships" xmlns:v="urn:schemas-microsoft-com:vml" xmlns:w="http://schemas.openxmlformats.org/wordprocessingml/2006/main" xmlns:w10="urn:schemas-microsoft-com:office:word" xmlns:wp="http://schemas.openxmlformats.org/drawingml/2006/wordprocessingDrawing" xmlns:wps="http://schemas.microsoft.com/office/word/2010/wordprocessingShape" xmlns:wpg="http://schemas.microsoft.com/office/word/2010/wordprocessingGroup" xmlns:mc="http://schemas.openxmlformats.org/markup-compatibility/2006" xmlns:wp14="http://schemas.microsoft.com/office/word/2010/wordprocessingDrawing" xmlns:w14="http://schemas.microsoft.com/office/word/2010/wordml" xmlns:a="http://schemas.openxmlformats.org/drawingml/2006/main" xmlns:pic="http://schemas.openxmlformats.org/drawingml/2006/picture" xmlns:a14="http://schemas.microsoft.com/office/drawing/2010/main" mc:Ignorable="w14 wp14">
   <w:body>
     <w:p xmlns:wp14="http://schemas.microsoft.com/office/word/2010/wordml" wp14:textId="77777777">
       <w:pPr>
@@ -443,6 +443,85 @@
           </w:p>
         </w:tc>
       </w:tr>
+      <w:tr>
+        <w:trPr>
+          <w:trHeight w:val="570"/>
+        </w:trPr>
+        <w:tc>
+          <w:tcPr>
+            <w:cnfStyle w:val="001000000000" w:firstRow="0" w:lastRow="0" w:firstColumn="1" w:lastColumn="0" w:oddVBand="0" w:evenVBand="0" w:oddHBand="0" w:evenHBand="0" w:firstRowFirstColumn="0" w:firstRowLastColumn="0" w:lastRowFirstColumn="0" w:lastRowLastColumn="0"/>
+            <w:tcW w:w="1320" w:type="dxa"/>
+            <w:tcMar/>
+          </w:tcPr>
+          <w:p>
+            <w:pPr>
+              <w:pStyle w:val="Normal"/>
+              <w:bidi w:val="0"/>
+              <w:rPr>
+                <w:b w:val="0"/>
+                <w:bCs w:val="0"/>
+              </w:rPr>
+            </w:pPr>
+            <w:r>
+              <w:rPr>
+                <w:b w:val="0"/>
+                <w:bCs w:val="0"/>
+              </w:rPr>
+              <w:t>5.5</w:t>
+            </w:r>
+          </w:p>
+        </w:tc>
+        <w:tc>
+          <w:tcPr>
+            <w:cnfStyle w:val="000000000000" w:firstRow="0" w:lastRow="0" w:firstColumn="0" w:lastColumn="0" w:oddVBand="0" w:evenVBand="0" w:oddHBand="0" w:evenHBand="0" w:firstRowFirstColumn="0" w:firstRowLastColumn="0" w:lastRowFirstColumn="0" w:lastRowLastColumn="0"/>
+            <w:tcW w:w="1710" w:type="dxa"/>
+            <w:tcMar/>
+          </w:tcPr>
+          <w:p>
+            <w:pPr>
+              <w:pStyle w:val="Normal"/>
+            </w:pPr>
+            <w:r>
+              <w:rPr/>
+              <w:t>18/5/2026</w:t>
+            </w:r>
+          </w:p>
+        </w:tc>
+        <w:tc>
+          <w:tcPr>
+            <w:cnfStyle w:val="000000000000" w:firstRow="0" w:lastRow="0" w:firstColumn="0" w:lastColumn="0" w:oddVBand="0" w:evenVBand="0" w:oddHBand="0" w:evenHBand="0" w:firstRowFirstColumn="0" w:firstRowLastColumn="0" w:lastRowFirstColumn="0" w:lastRowLastColumn="0"/>
+            <w:tcW w:w="5985" w:type="dxa"/>
+            <w:tcMar/>
+          </w:tcPr>
+          <w:p>
+            <w:pPr>
+              <w:pStyle w:val="Normal"/>
+            </w:pPr>
+            <w:r>
+              <w:rPr/>
+              <w:t>Added reference to new web site for hosting schema files and other documentation.</w:t>
+            </w:r>
+          </w:p>
+          <w:p>
+            <w:pPr>
+              <w:pStyle w:val="Normal"/>
+            </w:pPr>
+            <w:r>
+              <w:rPr/>
+              <w:t>Updated details of how Ofcom genres should be encoded.</w:t>
+            </w:r>
+          </w:p>
+          <w:p>
+            <w:pPr>
+              <w:pStyle w:val="Normal"/>
+            </w:pPr>
+            <w:r>
+              <w:rPr/>
+              <w:t>Updated details of how regional variations should be handled.</w:t>
+            </w:r>
+          </w:p>
+        </w:tc>
+      </w:tr>
     </w:tbl>
     <w:p>
       <w:pPr>
@@ -2377,10 +2456,9 @@
         <w:t>Genre Constraints:</w:t>
       </w:r>
     </w:p>
-    <w:p xmlns:wp14="http://schemas.microsoft.com/office/word/2010/wordml" wp14:textId="77777777">
-      <w:pPr>
-        <w:pStyle w:val="Normal"/>
-        <w:rPr/>
+    <w:p xmlns:wp14="http://schemas.microsoft.com/office/word/2010/wordml" wp14:textId="18905E96">
+      <w:pPr>
+        <w:pStyle w:val="Normal"/>
       </w:pPr>
       <w:r>
         <w:rPr/>
@@ -2388,20 +2466,127 @@
       </w:r>
       <w:r>
         <w:rPr>
-          <w:b/>
-          <w:bCs/>
-        </w:rPr>
-        <w:t xml:space="preserve">Ofcom genre: </w:t>
-      </w:r>
-      <w:r>
-        <w:rPr/>
-        <w:t>Mandatory - exactly one required. The Ofcom genre value will be validated against Ofcom's official genre list.</w:t>
-      </w:r>
-    </w:p>
-    <w:p xmlns:wp14="http://schemas.microsoft.com/office/word/2010/wordml" wp14:textId="77777777">
-      <w:pPr>
-        <w:pStyle w:val="Normal"/>
-        <w:rPr/>
+          <w:b w:val="1"/>
+          <w:bCs w:val="1"/>
+        </w:rPr>
+        <w:t xml:space="preserve">Ofcom </w:t>
+      </w:r>
+      <w:r>
+        <w:rPr>
+          <w:b w:val="1"/>
+          <w:bCs w:val="1"/>
+        </w:rPr>
+        <w:t>genre</w:t>
+      </w:r>
+      <w:r>
+        <w:rPr>
+          <w:b w:val="1"/>
+          <w:bCs w:val="1"/>
+        </w:rPr>
+        <w:t xml:space="preserve">: </w:t>
+      </w:r>
+      <w:r>
+        <w:rPr/>
+        <w:t>Mandatory - exactly one required.</w:t>
+      </w:r>
+      <w:r>
+        <w:rPr/>
+        <w:t xml:space="preserve"> Ofcom </w:t>
+      </w:r>
+      <w:r>
+        <w:rPr/>
+        <w:t>genre</w:t>
+      </w:r>
+      <w:r>
+        <w:rPr/>
+        <w:t>s must be provided using the short code (</w:t>
+      </w:r>
+      <w:r>
+        <w:rPr/>
+        <w:t>e.g."CHDRA</w:t>
+      </w:r>
+      <w:r>
+        <w:rPr/>
+        <w:t>") rather than the long description (e.g. "Children's drama")</w:t>
+      </w:r>
+      <w:r>
+        <w:rPr/>
+        <w:t xml:space="preserve">. </w:t>
+      </w:r>
+      <w:r>
+        <w:rPr/>
+        <w:t xml:space="preserve">The Ofcom </w:t>
+      </w:r>
+      <w:r>
+        <w:rPr/>
+        <w:t>genre</w:t>
+      </w:r>
+      <w:r>
+        <w:rPr/>
+        <w:t xml:space="preserve"> value will be </w:t>
+      </w:r>
+      <w:r>
+        <w:rPr/>
+        <w:t>validated</w:t>
+      </w:r>
+      <w:r>
+        <w:rPr/>
+        <w:t xml:space="preserve"> against Ofcom's official </w:t>
+      </w:r>
+      <w:r>
+        <w:rPr/>
+        <w:t>genre</w:t>
+      </w:r>
+      <w:r>
+        <w:rPr/>
+        <w:t xml:space="preserve"> </w:t>
+      </w:r>
+      <w:r>
+        <w:rPr/>
+        <w:t xml:space="preserve">code </w:t>
+      </w:r>
+      <w:r>
+        <w:rPr/>
+        <w:t>list.</w:t>
+      </w:r>
+      <w:r>
+        <w:rPr/>
+        <w:t xml:space="preserve"> At the time of the last update of this document th</w:t>
+      </w:r>
+      <w:r>
+        <w:rPr/>
+        <w:t xml:space="preserve">e list of Ofcom </w:t>
+      </w:r>
+      <w:r>
+        <w:rPr/>
+        <w:t>genre</w:t>
+      </w:r>
+      <w:r>
+        <w:rPr/>
+        <w:t xml:space="preserve"> codes was as follows</w:t>
+      </w:r>
+      <w:r>
+        <w:rPr/>
+        <w:t>:</w:t>
+      </w:r>
+    </w:p>
+    <w:p>
+      <w:pPr>
+        <w:pStyle w:val="Normal"/>
+      </w:pPr>
+      <w:r>
+        <w:rPr/>
+        <w:t>ANIMATION, ARTINF, ARTPERF, CAFF, CHDRA, CHENT, CHILDANIM, CHINF, CHNEWS, CLASSMUS, CLOSE, COMOTH, CONTMUS, DOC, DRDOC, DROTH, EDOTH, ENOTH, FACTENT, FILM, GENFAC, GSOTHER, GSPRIZ, HISTORY, HOBLEISURE, HOMESHOP, LONG, NATENV, NEWS, NEWS24, NEWSNT, PARLCAFF, PARLNEWS, PPB, PRESCL, RELFAITH, RELSEV, SCHOOLS, SCIMEDTEC, SITCOM, SOCACT, SPECEVT, SPEVT, SPOTH, TALKMAG, WEATHER</w:t>
+      </w:r>
+    </w:p>
+    <w:p>
+      <w:pPr>
+        <w:pStyle w:val="Normal"/>
+      </w:pPr>
+    </w:p>
+    <w:p xmlns:wp14="http://schemas.microsoft.com/office/word/2010/wordml" wp14:textId="38A71DB3">
+      <w:pPr>
+        <w:pStyle w:val="Normal"/>
       </w:pPr>
       <w:r>
         <w:rPr/>
@@ -2409,14 +2594,88 @@
       </w:r>
       <w:r>
         <w:rPr>
-          <w:b/>
-          <w:bCs/>
-        </w:rPr>
-        <w:t xml:space="preserve">OfcomSuper genre: </w:t>
-      </w:r>
-      <w:r>
-        <w:rPr/>
-        <w:t>Optional - maximum one allowed. If omitted, will be automatically derived from the Ofcom genre (every Ofcom genre is a child of a pre-defined supergenre parent).</w:t>
+          <w:b w:val="1"/>
+          <w:bCs w:val="1"/>
+        </w:rPr>
+        <w:t>OfcomSuper</w:t>
+      </w:r>
+      <w:r>
+        <w:rPr>
+          <w:b w:val="1"/>
+          <w:bCs w:val="1"/>
+        </w:rPr>
+        <w:t xml:space="preserve"> </w:t>
+      </w:r>
+      <w:r>
+        <w:rPr>
+          <w:b w:val="1"/>
+          <w:bCs w:val="1"/>
+        </w:rPr>
+        <w:t>genre</w:t>
+      </w:r>
+      <w:r>
+        <w:rPr>
+          <w:b w:val="1"/>
+          <w:bCs w:val="1"/>
+        </w:rPr>
+        <w:t xml:space="preserve">: </w:t>
+      </w:r>
+      <w:r>
+        <w:rPr/>
+        <w:t xml:space="preserve">Optional - maximum one allowed. If omitted, will be automatically derived from the Ofcom </w:t>
+      </w:r>
+      <w:r>
+        <w:rPr/>
+        <w:t>genre</w:t>
+      </w:r>
+      <w:r>
+        <w:rPr/>
+        <w:t xml:space="preserve"> (every Ofcom </w:t>
+      </w:r>
+      <w:r>
+        <w:rPr/>
+        <w:t>genre</w:t>
+      </w:r>
+      <w:r>
+        <w:rPr/>
+        <w:t xml:space="preserve"> is a child of a pre-defined super</w:t>
+      </w:r>
+      <w:r>
+        <w:rPr/>
+        <w:t>genre</w:t>
+      </w:r>
+      <w:r>
+        <w:rPr/>
+        <w:t xml:space="preserve"> parent).</w:t>
+      </w:r>
+      <w:r>
+        <w:rPr/>
+        <w:t xml:space="preserve"> Once again this should be provided in the short code form. At the time of the last update of this document the list of Ofcom genre codes was as follows:</w:t>
+      </w:r>
+    </w:p>
+    <w:p>
+      <w:pPr>
+        <w:pStyle w:val="Normal"/>
+        <w:rPr>
+          <w:rFonts w:ascii="Arial" w:hAnsi="Arial" w:eastAsia="Arial" w:cs="Arial"/>
+          <w:noProof w:val="0"/>
+          <w:sz w:val="22"/>
+          <w:szCs w:val="22"/>
+          <w:lang w:val="en-GB"/>
+        </w:rPr>
+      </w:pPr>
+      <w:r>
+        <w:rPr>
+          <w:rFonts w:ascii="Arial" w:hAnsi="Arial" w:eastAsia="Arial" w:cs="Arial"/>
+          <w:noProof w:val="0"/>
+          <w:sz w:val="22"/>
+          <w:szCs w:val="22"/>
+          <w:lang w:val="en-GB"/>
+        </w:rPr>
+        <w:t>ARTS, CHILDREN, COMEDY, CRTAFFAIR, DRAMA, EDUCATION, ENT, FACTUAL, FACTUALENT, FTRFILMS, LEISURE, MISC, MUSIC, NEWSWTH, RELIGION, SPORT</w:t>
+      </w:r>
+      <w:r>
+        <w:br/>
       </w:r>
     </w:p>
     <w:p xmlns:wp14="http://schemas.microsoft.com/office/word/2010/wordml" wp14:textId="76908499">
@@ -6218,8 +6477,12 @@
     </w:p>
     <w:p>
       <w:pPr>
+        <w:pStyle w:val="Normal"/>
         <w:widowControl w:val="1"/>
-        <w:spacing w:before="0" w:after="0"/>
+        <w:suppressLineNumbers w:val="0"/>
+        <w:bidi w:val="0"/>
+        <w:spacing w:before="0" w:beforeAutospacing="off" w:after="0" w:afterAutospacing="off" w:line="259" w:lineRule="auto"/>
+        <w:ind w:left="0" w:right="0"/>
         <w:jc w:val="left"/>
         <w:rPr>
           <w:rFonts w:ascii="Arial" w:hAnsi="Arial" w:eastAsia="Arial" w:cs="Arial"/>
@@ -6230,7 +6493,6 @@
           <w:caps w:val="0"/>
           <w:smallCaps w:val="0"/>
           <w:noProof w:val="0"/>
-          <w:color w:val="000000" w:themeColor="accent6" w:themeTint="FF" w:themeShade="FF"/>
           <w:sz w:val="22"/>
           <w:szCs w:val="22"/>
           <w:lang w:val="en-GB"/>
@@ -6330,71 +6592,23 @@
           <w:szCs w:val="22"/>
           <w:lang w:val="en-GB"/>
         </w:rPr>
-        <w:t xml:space="preserve"> If the channel has not subchannels then no </w:t>
-      </w:r>
-      <w:r>
-        <w:rPr>
-          <w:rFonts w:ascii="Arial" w:hAnsi="Arial" w:eastAsia="Arial" w:cs="Arial"/>
-          <w:b w:val="0"/>
-          <w:bCs w:val="0"/>
-          <w:i w:val="0"/>
-          <w:iCs w:val="0"/>
-          <w:caps w:val="0"/>
-          <w:smallCaps w:val="0"/>
-          <w:noProof w:val="0"/>
-          <w:sz w:val="22"/>
-          <w:szCs w:val="22"/>
-          <w:lang w:val="en-GB"/>
-        </w:rPr>
-        <w:t>subChannel</w:t>
-      </w:r>
-      <w:r>
-        <w:rPr>
-          <w:rFonts w:ascii="Arial" w:hAnsi="Arial" w:eastAsia="Arial" w:cs="Arial"/>
-          <w:b w:val="0"/>
-          <w:bCs w:val="0"/>
-          <w:i w:val="0"/>
-          <w:iCs w:val="0"/>
-          <w:caps w:val="0"/>
-          <w:smallCaps w:val="0"/>
-          <w:noProof w:val="0"/>
-          <w:sz w:val="22"/>
-          <w:szCs w:val="22"/>
-          <w:lang w:val="en-GB"/>
-        </w:rPr>
-        <w:t xml:space="preserve"> objects need be supplied and a self-closing &lt;</w:t>
-      </w:r>
-      <w:r>
-        <w:rPr>
-          <w:rFonts w:ascii="Arial" w:hAnsi="Arial" w:eastAsia="Arial" w:cs="Arial"/>
-          <w:b w:val="0"/>
-          <w:bCs w:val="0"/>
-          <w:i w:val="0"/>
-          <w:iCs w:val="0"/>
-          <w:caps w:val="0"/>
-          <w:smallCaps w:val="0"/>
-          <w:noProof w:val="0"/>
-          <w:sz w:val="22"/>
-          <w:szCs w:val="22"/>
-          <w:lang w:val="en-GB"/>
-        </w:rPr>
-        <w:t>ChannelPlatform</w:t>
-      </w:r>
-      <w:r>
-        <w:rPr>
-          <w:rFonts w:ascii="Arial" w:hAnsi="Arial" w:eastAsia="Arial" w:cs="Arial"/>
-          <w:b w:val="0"/>
-          <w:bCs w:val="0"/>
-          <w:i w:val="0"/>
-          <w:iCs w:val="0"/>
-          <w:caps w:val="0"/>
-          <w:smallCaps w:val="0"/>
-          <w:noProof w:val="0"/>
-          <w:sz w:val="22"/>
-          <w:szCs w:val="22"/>
-          <w:lang w:val="en-GB"/>
-        </w:rPr>
-        <w:t xml:space="preserve"> /&gt; object can be used.</w:t>
+        <w:t xml:space="preserve"> </w:t>
+      </w:r>
+      <w:r>
+        <w:rPr>
+          <w:rFonts w:ascii="Arial" w:hAnsi="Arial" w:eastAsia="Arial" w:cs="Arial"/>
+          <w:b w:val="0"/>
+          <w:bCs w:val="0"/>
+          <w:i w:val="0"/>
+          <w:iCs w:val="0"/>
+          <w:caps w:val="0"/>
+          <w:smallCaps w:val="0"/>
+          <w:noProof w:val="0"/>
+          <w:sz w:val="22"/>
+          <w:szCs w:val="22"/>
+          <w:lang w:val="en-GB"/>
+        </w:rPr>
+        <w:t>For more details see section on Regional Variations below.</w:t>
       </w:r>
     </w:p>
     <w:p>
@@ -7850,11 +8064,807 @@
     <w:p xmlns:wp14="http://schemas.microsoft.com/office/word/2010/wordml" wp14:textId="77777777">
       <w:pPr>
         <w:pStyle w:val="Normal"/>
-        <w:rPr/>
       </w:pPr>
       <w:r>
         <w:rPr/>
         <w:t>If a single field has changed, the entire record should be re-posted including all other mandatory fields, even if those fields have not changed. Optional fields need not be resent if they haven't changed, although including them will not cause any issues.</w:t>
+      </w:r>
+    </w:p>
+    <w:p>
+      <w:pPr>
+        <w:pStyle w:val="Heading1"/>
+      </w:pPr>
+      <w:r>
+        <w:rPr/>
+        <w:t>Regional Variations</w:t>
+      </w:r>
+    </w:p>
+    <w:p>
+      <w:pPr>
+        <w:pStyle w:val="Normal"/>
+      </w:pPr>
+      <w:r>
+        <w:rPr/>
+        <w:t>Several broadcasters operate channels with regional or sub-brand variants (e.g. BBC One Wales, BBC One Scotland; ITV regions). Diamond 2 needs to distinguish core network output from regional opt-outs to support CDN's reporting requirements, which include core-network-only reporting, regional-only reporting, user-experience reporting for a given region, and full-channel reporting across the network and all subchannels.</w:t>
+      </w:r>
+    </w:p>
+    <w:p>
+      <w:pPr>
+        <w:pStyle w:val="Normal"/>
+      </w:pPr>
+    </w:p>
+    <w:p>
+      <w:pPr>
+        <w:pStyle w:val="Heading2"/>
+      </w:pPr>
+      <w:r>
+        <w:rPr/>
+        <w:t>The "</w:t>
+      </w:r>
+      <w:r>
+        <w:rPr/>
+        <w:t>C</w:t>
+      </w:r>
+      <w:r>
+        <w:rPr/>
+        <w:t xml:space="preserve">ore </w:t>
+      </w:r>
+      <w:r>
+        <w:rPr/>
+        <w:t>P</w:t>
+      </w:r>
+      <w:r>
+        <w:rPr/>
+        <w:t xml:space="preserve">lus </w:t>
+      </w:r>
+      <w:r>
+        <w:rPr/>
+        <w:t>V</w:t>
+      </w:r>
+      <w:r>
+        <w:rPr/>
+        <w:t xml:space="preserve">ariations" </w:t>
+      </w:r>
+      <w:r>
+        <w:rPr/>
+        <w:t>M</w:t>
+      </w:r>
+      <w:r>
+        <w:rPr/>
+        <w:t>odel</w:t>
+      </w:r>
+    </w:p>
+    <w:p>
+      <w:pPr>
+        <w:pStyle w:val="Normal"/>
+      </w:pPr>
+      <w:r>
+        <w:rPr/>
+        <w:t>Diamond 2 uses a "core plus variations" model. A single Publication record represents the broadcast on the core network feed. Where a regional variation overrides the core feed in a specific region, an additional Publication record is sent for that variation. Both records carry the same &lt;ChannelPlatform&gt; but differ in their &lt;SubChannel&gt;.</w:t>
+      </w:r>
+    </w:p>
+    <w:p>
+      <w:pPr>
+        <w:pStyle w:val="Normal"/>
+      </w:pPr>
+    </w:p>
+    <w:p>
+      <w:pPr>
+        <w:pStyle w:val="Normal"/>
+      </w:pPr>
+      <w:r>
+        <w:rPr/>
+        <w:t>Reporting then follows directly from this:</w:t>
+      </w:r>
+    </w:p>
+    <w:p>
+      <w:pPr>
+        <w:pStyle w:val="ListParagraph"/>
+        <w:numPr>
+          <w:ilvl w:val="0"/>
+          <w:numId w:val="2"/>
+        </w:numPr>
+        <w:rPr/>
+      </w:pPr>
+      <w:r>
+        <w:rPr/>
+        <w:t>Core network only: publications where &lt;</w:t>
+      </w:r>
+      <w:r>
+        <w:rPr/>
+        <w:t>SubChannel</w:t>
+      </w:r>
+      <w:r>
+        <w:rPr/>
+        <w:t>&gt; is marked as the core feed.</w:t>
+      </w:r>
+    </w:p>
+    <w:p>
+      <w:pPr>
+        <w:pStyle w:val="ListParagraph"/>
+        <w:numPr>
+          <w:ilvl w:val="0"/>
+          <w:numId w:val="2"/>
+        </w:numPr>
+        <w:rPr/>
+      </w:pPr>
+      <w:r>
+        <w:rPr/>
+        <w:t>Regional only (region X): publications where &lt;SubChannel&gt; is X.</w:t>
+      </w:r>
+    </w:p>
+    <w:p>
+      <w:pPr>
+        <w:pStyle w:val="ListParagraph"/>
+        <w:numPr>
+          <w:ilvl w:val="0"/>
+          <w:numId w:val="2"/>
+        </w:numPr>
+        <w:rPr/>
+      </w:pPr>
+      <w:r>
+        <w:rPr/>
+        <w:t>User experience for region X: publications where &lt;SubChannel&gt; is either the core feed or X.</w:t>
+      </w:r>
+    </w:p>
+    <w:p>
+      <w:pPr>
+        <w:pStyle w:val="ListParagraph"/>
+        <w:numPr>
+          <w:ilvl w:val="0"/>
+          <w:numId w:val="2"/>
+        </w:numPr>
+        <w:rPr/>
+      </w:pPr>
+      <w:r>
+        <w:rPr/>
+        <w:t>All content: all publications for the channel.</w:t>
+      </w:r>
+    </w:p>
+    <w:p>
+      <w:pPr>
+        <w:pStyle w:val="Normal"/>
+      </w:pPr>
+      <w:r>
+        <w:rPr/>
+        <w:t xml:space="preserve"> </w:t>
+      </w:r>
+    </w:p>
+    <w:p>
+      <w:pPr>
+        <w:pStyle w:val="Heading2"/>
+      </w:pPr>
+      <w:r>
+        <w:rPr/>
+        <w:t xml:space="preserve">Indicating </w:t>
+      </w:r>
+      <w:r>
+        <w:rPr/>
+        <w:t>T</w:t>
+      </w:r>
+      <w:r>
+        <w:rPr/>
+        <w:t xml:space="preserve">he </w:t>
+      </w:r>
+      <w:r>
+        <w:rPr/>
+        <w:t>C</w:t>
+      </w:r>
+      <w:r>
+        <w:rPr/>
+        <w:t xml:space="preserve">ore </w:t>
+      </w:r>
+      <w:r>
+        <w:rPr/>
+        <w:t>F</w:t>
+      </w:r>
+      <w:r>
+        <w:rPr/>
+        <w:t xml:space="preserve">eed: </w:t>
+      </w:r>
+      <w:r>
+        <w:rPr/>
+        <w:t>T</w:t>
+      </w:r>
+      <w:r>
+        <w:rPr/>
+        <w:t xml:space="preserve">he </w:t>
+      </w:r>
+      <w:r>
+        <w:rPr/>
+        <w:t>isCore</w:t>
+      </w:r>
+      <w:r>
+        <w:rPr/>
+        <w:t xml:space="preserve"> </w:t>
+      </w:r>
+      <w:r>
+        <w:rPr/>
+        <w:t>A</w:t>
+      </w:r>
+      <w:r>
+        <w:rPr/>
+        <w:t>ttribute</w:t>
+      </w:r>
+    </w:p>
+    <w:p>
+      <w:pPr>
+        <w:pStyle w:val="Normal"/>
+      </w:pPr>
+      <w:r>
+        <w:rPr/>
+        <w:t>&lt;SubChannel&gt; is mandatory on every &lt;ChannelPlatform&gt;. To indicate that a particular subchannel represents the core network feed, the isCore="true" attribute is set on that &lt;SubChannel&gt;. Regional subchannels omit the attribute (or set it to false).</w:t>
+      </w:r>
+    </w:p>
+    <w:p>
+      <w:pPr>
+        <w:pStyle w:val="Normal"/>
+      </w:pPr>
+      <w:r>
+        <w:rPr/>
+        <w:t>Within any single &lt;ChannelPlatform&gt;, at most one &lt;SubChannel&gt; may carry isCore="true".</w:t>
+      </w:r>
+    </w:p>
+    <w:p>
+      <w:pPr>
+        <w:pStyle w:val="Normal"/>
+      </w:pPr>
+      <w:r>
+        <w:rPr/>
+        <w:t xml:space="preserve"> </w:t>
+      </w:r>
+    </w:p>
+    <w:p>
+      <w:pPr>
+        <w:pStyle w:val="Normal"/>
+      </w:pPr>
+      <w:r>
+        <w:rPr/>
+        <w:t xml:space="preserve">Broadcasters who </w:t>
+      </w:r>
+      <w:r>
+        <w:rPr/>
+        <w:t xml:space="preserve">do not </w:t>
+      </w:r>
+      <w:r>
+        <w:rPr/>
+        <w:t>operate</w:t>
+      </w:r>
+      <w:r>
+        <w:rPr/>
+        <w:t xml:space="preserve"> </w:t>
+      </w:r>
+      <w:r>
+        <w:rPr/>
+        <w:t>any</w:t>
+      </w:r>
+      <w:r>
+        <w:rPr/>
+        <w:t xml:space="preserve"> regional subchannels </w:t>
+      </w:r>
+      <w:r>
+        <w:rPr/>
+        <w:t xml:space="preserve">should </w:t>
+      </w:r>
+      <w:r>
+        <w:rPr/>
+        <w:t xml:space="preserve">include </w:t>
+      </w:r>
+      <w:r>
+        <w:rPr/>
+        <w:t>a single hard coded</w:t>
+      </w:r>
+      <w:r>
+        <w:rPr/>
+        <w:t xml:space="preserve"> &lt;</w:t>
+      </w:r>
+      <w:r>
+        <w:rPr/>
+        <w:t>SubChannel</w:t>
+      </w:r>
+      <w:r>
+        <w:rPr/>
+        <w:t xml:space="preserve">&gt; with </w:t>
+      </w:r>
+      <w:r>
+        <w:rPr/>
+        <w:t>isCore</w:t>
+      </w:r>
+      <w:r>
+        <w:rPr/>
+        <w:t xml:space="preserve">="true" on every Publication. The id and label values can be whatever is most </w:t>
+      </w:r>
+      <w:r>
+        <w:rPr/>
+        <w:t>appropriate for</w:t>
+      </w:r>
+      <w:r>
+        <w:rPr/>
+        <w:t xml:space="preserve"> the broadcaster, typically a single fixed value </w:t>
+      </w:r>
+      <w:r>
+        <w:rPr/>
+        <w:t>hard-coded</w:t>
+      </w:r>
+      <w:r>
+        <w:rPr/>
+        <w:t xml:space="preserve"> into the generation pipeline.</w:t>
+      </w:r>
+      <w:r>
+        <w:rPr/>
+        <w:t xml:space="preserve"> E.g.</w:t>
+      </w:r>
+    </w:p>
+    <w:p>
+      <w:pPr>
+        <w:pStyle w:val="Normal"/>
+      </w:pPr>
+    </w:p>
+    <w:p>
+      <w:pPr>
+        <w:pStyle w:val="Normal"/>
+        <w:ind w:left="720"/>
+      </w:pPr>
+      <w:r>
+        <w:rPr>
+          <w:rFonts w:ascii="Arial" w:hAnsi="Arial" w:eastAsia="Arial" w:cs="Arial"/>
+          <w:noProof w:val="0"/>
+          <w:color w:val="2B303B"/>
+          <w:sz w:val="22"/>
+          <w:szCs w:val="22"/>
+          <w:lang w:val="en-GB"/>
+        </w:rPr>
+        <w:t>&lt;</w:t>
+      </w:r>
+      <w:r>
+        <w:rPr>
+          <w:rFonts w:ascii="Arial" w:hAnsi="Arial" w:eastAsia="Arial" w:cs="Arial"/>
+          <w:noProof w:val="0"/>
+          <w:color w:val="B80A18"/>
+          <w:sz w:val="22"/>
+          <w:szCs w:val="22"/>
+          <w:lang w:val="en-GB"/>
+        </w:rPr>
+        <w:t xml:space="preserve">SubChannel </w:t>
+      </w:r>
+      <w:r>
+        <w:rPr>
+          <w:rFonts w:ascii="Arial" w:hAnsi="Arial" w:eastAsia="Arial" w:cs="Arial"/>
+          <w:noProof w:val="0"/>
+          <w:color w:val="BD0F1E"/>
+          <w:sz w:val="22"/>
+          <w:szCs w:val="22"/>
+          <w:lang w:val="en-GB"/>
+        </w:rPr>
+        <w:t>label</w:t>
+      </w:r>
+      <w:r>
+        <w:rPr>
+          <w:rFonts w:ascii="Arial" w:hAnsi="Arial" w:eastAsia="Arial" w:cs="Arial"/>
+          <w:noProof w:val="0"/>
+          <w:color w:val="2B303B"/>
+          <w:sz w:val="22"/>
+          <w:szCs w:val="22"/>
+          <w:lang w:val="en-GB"/>
+        </w:rPr>
+        <w:t>="</w:t>
+      </w:r>
+      <w:r>
+        <w:rPr>
+          <w:rFonts w:ascii="Arial" w:hAnsi="Arial" w:eastAsia="Arial" w:cs="Arial"/>
+          <w:noProof w:val="0"/>
+          <w:color w:val="008000"/>
+          <w:sz w:val="22"/>
+          <w:szCs w:val="22"/>
+          <w:lang w:val="en-GB"/>
+        </w:rPr>
+        <w:t>Network</w:t>
+      </w:r>
+      <w:r>
+        <w:rPr>
+          <w:rFonts w:ascii="Arial" w:hAnsi="Arial" w:eastAsia="Arial" w:cs="Arial"/>
+          <w:noProof w:val="0"/>
+          <w:color w:val="2B303B"/>
+          <w:sz w:val="22"/>
+          <w:szCs w:val="22"/>
+          <w:lang w:val="en-GB"/>
+        </w:rPr>
+        <w:t>"</w:t>
+      </w:r>
+      <w:r>
+        <w:rPr>
+          <w:rFonts w:ascii="Arial" w:hAnsi="Arial" w:eastAsia="Arial" w:cs="Arial"/>
+          <w:noProof w:val="0"/>
+          <w:color w:val="B80A18"/>
+          <w:sz w:val="22"/>
+          <w:szCs w:val="22"/>
+          <w:lang w:val="en-GB"/>
+        </w:rPr>
+        <w:t xml:space="preserve"> </w:t>
+      </w:r>
+      <w:r>
+        <w:rPr>
+          <w:rFonts w:ascii="Arial" w:hAnsi="Arial" w:eastAsia="Arial" w:cs="Arial"/>
+          <w:noProof w:val="0"/>
+          <w:color w:val="BD0F1E"/>
+          <w:sz w:val="22"/>
+          <w:szCs w:val="22"/>
+          <w:lang w:val="en-GB"/>
+        </w:rPr>
+        <w:t>id</w:t>
+      </w:r>
+      <w:r>
+        <w:rPr>
+          <w:rFonts w:ascii="Arial" w:hAnsi="Arial" w:eastAsia="Arial" w:cs="Arial"/>
+          <w:noProof w:val="0"/>
+          <w:color w:val="2B303B"/>
+          <w:sz w:val="22"/>
+          <w:szCs w:val="22"/>
+          <w:lang w:val="en-GB"/>
+        </w:rPr>
+        <w:t>="</w:t>
+      </w:r>
+      <w:r>
+        <w:rPr>
+          <w:rFonts w:ascii="Arial" w:hAnsi="Arial" w:eastAsia="Arial" w:cs="Arial"/>
+          <w:noProof w:val="0"/>
+          <w:color w:val="008000"/>
+          <w:sz w:val="22"/>
+          <w:szCs w:val="22"/>
+          <w:lang w:val="en-GB"/>
+        </w:rPr>
+        <w:t>network</w:t>
+      </w:r>
+      <w:r>
+        <w:rPr>
+          <w:rFonts w:ascii="Arial" w:hAnsi="Arial" w:eastAsia="Arial" w:cs="Arial"/>
+          <w:noProof w:val="0"/>
+          <w:color w:val="2B303B"/>
+          <w:sz w:val="22"/>
+          <w:szCs w:val="22"/>
+          <w:lang w:val="en-GB"/>
+        </w:rPr>
+        <w:t>"</w:t>
+      </w:r>
+      <w:r>
+        <w:rPr>
+          <w:rFonts w:ascii="Arial" w:hAnsi="Arial" w:eastAsia="Arial" w:cs="Arial"/>
+          <w:noProof w:val="0"/>
+          <w:color w:val="B80A18"/>
+          <w:sz w:val="22"/>
+          <w:szCs w:val="22"/>
+          <w:lang w:val="en-GB"/>
+        </w:rPr>
+        <w:t xml:space="preserve"> </w:t>
+      </w:r>
+      <w:r>
+        <w:rPr>
+          <w:rFonts w:ascii="Arial" w:hAnsi="Arial" w:eastAsia="Arial" w:cs="Arial"/>
+          <w:noProof w:val="0"/>
+          <w:color w:val="BD0F1E"/>
+          <w:sz w:val="22"/>
+          <w:szCs w:val="22"/>
+          <w:lang w:val="en-GB"/>
+        </w:rPr>
+        <w:t>isCore</w:t>
+      </w:r>
+      <w:r>
+        <w:rPr>
+          <w:rFonts w:ascii="Arial" w:hAnsi="Arial" w:eastAsia="Arial" w:cs="Arial"/>
+          <w:noProof w:val="0"/>
+          <w:color w:val="2B303B"/>
+          <w:sz w:val="22"/>
+          <w:szCs w:val="22"/>
+          <w:lang w:val="en-GB"/>
+        </w:rPr>
+        <w:t>="</w:t>
+      </w:r>
+      <w:r>
+        <w:rPr>
+          <w:rFonts w:ascii="Arial" w:hAnsi="Arial" w:eastAsia="Arial" w:cs="Arial"/>
+          <w:noProof w:val="0"/>
+          <w:color w:val="008000"/>
+          <w:sz w:val="22"/>
+          <w:szCs w:val="22"/>
+          <w:lang w:val="en-GB"/>
+        </w:rPr>
+        <w:t>true</w:t>
+      </w:r>
+      <w:r>
+        <w:rPr>
+          <w:rFonts w:ascii="Arial" w:hAnsi="Arial" w:eastAsia="Arial" w:cs="Arial"/>
+          <w:noProof w:val="0"/>
+          <w:color w:val="2B303B"/>
+          <w:sz w:val="22"/>
+          <w:szCs w:val="22"/>
+          <w:lang w:val="en-GB"/>
+        </w:rPr>
+        <w:t>"/&gt;</w:t>
+      </w:r>
+    </w:p>
+    <w:p>
+      <w:pPr>
+        <w:pStyle w:val="Normal"/>
+        <w:rPr>
+          <w:rFonts w:ascii="Arial" w:hAnsi="Arial" w:eastAsia="Arial" w:cs="Arial"/>
+          <w:noProof w:val="0"/>
+          <w:color w:val="2B303B"/>
+          <w:sz w:val="22"/>
+          <w:szCs w:val="22"/>
+          <w:lang w:val="en-GB"/>
+        </w:rPr>
+      </w:pPr>
+    </w:p>
+    <w:p>
+      <w:pPr>
+        <w:pStyle w:val="Normal"/>
+      </w:pPr>
+      <w:r>
+        <w:rPr/>
+        <w:t>Broadcasters who do operate subchannels mark their core network subchannel with isCore="true" and identify any regional subchannels without the attribute.</w:t>
+      </w:r>
+    </w:p>
+    <w:p>
+      <w:pPr>
+        <w:pStyle w:val="Normal"/>
+      </w:pPr>
+      <w:r>
+        <w:rPr/>
+        <w:t xml:space="preserve"> </w:t>
+      </w:r>
+    </w:p>
+    <w:p>
+      <w:pPr>
+        <w:pStyle w:val="Normal"/>
+      </w:pPr>
+      <w:r>
+        <w:rPr/>
+        <w:t>The "core network" concept is therefore available to broadcasters who have one, and unobtrusive to those who don't. A broadcaster with no national feed at all (e.g. an entirely regional service) would simply never use isCore="true", sending only regional &lt;SubChannel&gt; records.</w:t>
+      </w:r>
+    </w:p>
+    <w:p>
+      <w:pPr>
+        <w:pStyle w:val="Normal"/>
+      </w:pPr>
+    </w:p>
+    <w:p>
+      <w:pPr>
+        <w:pStyle w:val="Heading2"/>
+      </w:pPr>
+      <w:r>
+        <w:rPr/>
+        <w:t xml:space="preserve">Invalid </w:t>
+      </w:r>
+      <w:r>
+        <w:rPr/>
+        <w:t>C</w:t>
+      </w:r>
+      <w:r>
+        <w:rPr/>
+        <w:t>ombinations</w:t>
+      </w:r>
+    </w:p>
+    <w:p>
+      <w:pPr>
+        <w:pStyle w:val="Normal"/>
+      </w:pPr>
+      <w:r>
+        <w:rPr/>
+        <w:t>A single &lt;ChannelPlatform&gt; that contains both an isCore="true" &lt;SubChannel&gt; and one or more other &lt;SubChannel&gt; elements is semantically invalid. Either the content went out on the core network feed (which by definition spans all regions unless overridden) or it went out on a specific subset of subchannels. The two cannot be combined in one record.</w:t>
+      </w:r>
+    </w:p>
+    <w:p>
+      <w:pPr>
+        <w:pStyle w:val="Normal"/>
+      </w:pPr>
+      <w:r>
+        <w:rPr/>
+        <w:t>Similarly, a &lt;ChannelPlatform&gt; cannot contain more than one &lt;SubChannel&gt; with isCore="true".</w:t>
+      </w:r>
+    </w:p>
+    <w:p>
+      <w:pPr>
+        <w:pStyle w:val="Normal"/>
+      </w:pPr>
+    </w:p>
+    <w:p>
+      <w:pPr>
+        <w:pStyle w:val="Normal"/>
+      </w:pPr>
+      <w:r>
+        <w:rPr/>
+        <w:t>These constraints cannot be expressed in XSD 1.0, so they are enforced at TEP's ingestion layer. Affected records will be rejected and the error reported back via the standard error feedback channel.</w:t>
+      </w:r>
+    </w:p>
+    <w:p>
+      <w:pPr>
+        <w:pStyle w:val="Normal"/>
+      </w:pPr>
+    </w:p>
+    <w:p>
+      <w:pPr>
+        <w:pStyle w:val="Heading2"/>
+      </w:pPr>
+      <w:r>
+        <w:rPr/>
+        <w:t>Examples</w:t>
+      </w:r>
+    </w:p>
+    <w:p>
+      <w:pPr>
+        <w:pStyle w:val="Normal"/>
+      </w:pPr>
+      <w:r>
+        <w:rPr/>
+        <w:t>A BBC One transmission of a national news bulletin at 22:00, broadcast across the entire UK:</w:t>
+      </w:r>
+    </w:p>
+    <w:p>
+      <w:pPr>
+        <w:pStyle w:val="Normal"/>
+      </w:pPr>
+      <w:r>
+        <w:drawing>
+          <wp:inline wp14:editId="0130344C" wp14:anchorId="7AA2C731">
+            <wp:extent cx="5723809" cy="1847619"/>
+            <wp:effectExtent l="0" t="0" r="0" b="0"/>
+            <wp:docPr id="1973867299" name="drawing"/>
+            <wp:cNvGraphicFramePr>
+              <a:graphicFrameLocks noChangeAspect="1"/>
+            </wp:cNvGraphicFramePr>
+            <a:graphic>
+              <a:graphicData xmlns:a="http://schemas.openxmlformats.org/drawingml/2006/main" uri="http://schemas.openxmlformats.org/drawingml/2006/picture">
+                <pic:pic xmlns:pic="http://schemas.openxmlformats.org/drawingml/2006/picture">
+                  <pic:nvPicPr>
+                    <pic:cNvPr id="1973867299" name="Picture 1973867299"/>
+                    <pic:cNvPicPr/>
+                  </pic:nvPicPr>
+                  <pic:blipFill>
+                    <a:blip xmlns:r="http://schemas.openxmlformats.org/officeDocument/2006/relationships" r:embed="rId852953252">
+                      <a:extLst>
+                        <a:ext uri="{28A0092B-C50C-407E-A947-70E740481C1C}">
+                          <a14:useLocalDpi xmlns:a14="http://schemas.microsoft.com/office/drawing/2010/main"/>
+                        </a:ext>
+                      </a:extLst>
+                    </a:blip>
+                    <a:stretch>
+                      <a:fillRect/>
+                    </a:stretch>
+                  </pic:blipFill>
+                  <pic:spPr>
+                    <a:xfrm>
+                      <a:off x="0" y="0"/>
+                      <a:ext cx="5723809" cy="1847619"/>
+                    </a:xfrm>
+                    <a:prstGeom prst="rect">
+                      <a:avLst/>
+                    </a:prstGeom>
+                  </pic:spPr>
+                </pic:pic>
+              </a:graphicData>
+            </a:graphic>
+          </wp:inline>
+        </w:drawing>
+      </w:r>
+    </w:p>
+    <w:p>
+      <w:pPr>
+        <w:pStyle w:val="Normal"/>
+      </w:pPr>
+      <w:r>
+        <w:rPr/>
+        <w:t>A BBC One Wales rugby opt-out replacing that bulletin in Wales only at the same slot:</w:t>
+      </w:r>
+    </w:p>
+    <w:p>
+      <w:pPr>
+        <w:pStyle w:val="Normal"/>
+      </w:pPr>
+      <w:r>
+        <w:drawing>
+          <wp:inline wp14:editId="19CD227E" wp14:anchorId="2FE6125E">
+            <wp:extent cx="5724525" cy="1885950"/>
+            <wp:effectExtent l="0" t="0" r="0" b="0"/>
+            <wp:docPr id="47470795" name="drawing"/>
+            <wp:cNvGraphicFramePr>
+              <a:graphicFrameLocks noChangeAspect="1"/>
+            </wp:cNvGraphicFramePr>
+            <a:graphic>
+              <a:graphicData xmlns:a="http://schemas.openxmlformats.org/drawingml/2006/main" uri="http://schemas.openxmlformats.org/drawingml/2006/picture">
+                <pic:pic xmlns:pic="http://schemas.openxmlformats.org/drawingml/2006/picture">
+                  <pic:nvPicPr>
+                    <pic:cNvPr id="47470795" name="Picture 47470795"/>
+                    <pic:cNvPicPr/>
+                  </pic:nvPicPr>
+                  <pic:blipFill>
+                    <a:blip xmlns:r="http://schemas.openxmlformats.org/officeDocument/2006/relationships" r:embed="rId1092209644">
+                      <a:extLst>
+                        <a:ext uri="{28A0092B-C50C-407E-A947-70E740481C1C}">
+                          <a14:useLocalDpi xmlns:a14="http://schemas.microsoft.com/office/drawing/2010/main"/>
+                        </a:ext>
+                      </a:extLst>
+                    </a:blip>
+                    <a:stretch>
+                      <a:fillRect/>
+                    </a:stretch>
+                  </pic:blipFill>
+                  <pic:spPr>
+                    <a:xfrm>
+                      <a:off x="0" y="0"/>
+                      <a:ext cx="5724525" cy="1885950"/>
+                    </a:xfrm>
+                    <a:prstGeom prst="rect">
+                      <a:avLst/>
+                    </a:prstGeom>
+                  </pic:spPr>
+                </pic:pic>
+              </a:graphicData>
+            </a:graphic>
+          </wp:inline>
+        </w:drawing>
+      </w:r>
+    </w:p>
+    <w:p>
+      <w:pPr>
+        <w:pStyle w:val="Normal"/>
+      </w:pPr>
+      <w:r>
+        <w:rPr>
+          <w:rFonts w:ascii="Arial" w:hAnsi="Arial" w:eastAsia="Arial" w:cs="Arial"/>
+          <w:noProof w:val="0"/>
+          <w:sz w:val="22"/>
+          <w:szCs w:val="22"/>
+          <w:lang w:val="en-GB"/>
+        </w:rPr>
+        <w:t>A broadcaster with no regional subchannels at all uses a single core-marked subchannel everywhere:</w:t>
+      </w:r>
+    </w:p>
+    <w:p>
+      <w:pPr>
+        <w:pStyle w:val="Normal"/>
+      </w:pPr>
+      <w:r>
+        <w:drawing>
+          <wp:inline wp14:editId="57E268DC" wp14:anchorId="2793686F">
+            <wp:extent cx="5724525" cy="1724025"/>
+            <wp:effectExtent l="0" t="0" r="0" b="0"/>
+            <wp:docPr id="1582901831" name="drawing"/>
+            <wp:cNvGraphicFramePr>
+              <a:graphicFrameLocks noChangeAspect="1"/>
+            </wp:cNvGraphicFramePr>
+            <a:graphic>
+              <a:graphicData xmlns:a="http://schemas.openxmlformats.org/drawingml/2006/main" uri="http://schemas.openxmlformats.org/drawingml/2006/picture">
+                <pic:pic xmlns:pic="http://schemas.openxmlformats.org/drawingml/2006/picture">
+                  <pic:nvPicPr>
+                    <pic:cNvPr id="1582901831" name="Picture 1582901831"/>
+                    <pic:cNvPicPr/>
+                  </pic:nvPicPr>
+                  <pic:blipFill>
+                    <a:blip xmlns:r="http://schemas.openxmlformats.org/officeDocument/2006/relationships" r:embed="rId1241791350">
+                      <a:extLst>
+                        <a:ext uri="{28A0092B-C50C-407E-A947-70E740481C1C}">
+                          <a14:useLocalDpi xmlns:a14="http://schemas.microsoft.com/office/drawing/2010/main"/>
+                        </a:ext>
+                      </a:extLst>
+                    </a:blip>
+                    <a:stretch>
+                      <a:fillRect/>
+                    </a:stretch>
+                  </pic:blipFill>
+                  <pic:spPr>
+                    <a:xfrm>
+                      <a:off x="0" y="0"/>
+                      <a:ext cx="5724525" cy="1724025"/>
+                    </a:xfrm>
+                    <a:prstGeom prst="rect">
+                      <a:avLst/>
+                    </a:prstGeom>
+                  </pic:spPr>
+                </pic:pic>
+              </a:graphicData>
+            </a:graphic>
+          </wp:inline>
+        </w:drawing>
       </w:r>
     </w:p>
     <w:p xmlns:wp14="http://schemas.microsoft.com/office/word/2010/wordml" wp14:textId="77777777">
@@ -7974,70 +8984,91 @@
         <w:t>urn:cdn:pdx:1.0</w:t>
       </w:r>
     </w:p>
+    <w:p xmlns:wp14="http://schemas.microsoft.com/office/word/2010/wordml" wp14:textId="316B762B">
+      <w:pPr>
+        <w:pStyle w:val="Normal"/>
+      </w:pPr>
+      <w:r>
+        <w:rPr>
+          <w:b w:val="1"/>
+          <w:bCs w:val="1"/>
+        </w:rPr>
+        <w:t xml:space="preserve">Schema Version: </w:t>
+      </w:r>
+      <w:r>
+        <w:rPr/>
+        <w:t>1.</w:t>
+      </w:r>
+      <w:r>
+        <w:rPr/>
+        <w:t>1</w:t>
+      </w:r>
+    </w:p>
+    <w:p xmlns:wp14="http://schemas.microsoft.com/office/word/2010/wordml" wp14:textId="44EB141F">
+      <w:pPr>
+        <w:pStyle w:val="Normal"/>
+      </w:pPr>
+      <w:r>
+        <w:rPr>
+          <w:b w:val="1"/>
+          <w:bCs w:val="1"/>
+        </w:rPr>
+        <w:t xml:space="preserve">Date: </w:t>
+      </w:r>
+      <w:r>
+        <w:rPr/>
+        <w:t xml:space="preserve">May </w:t>
+      </w:r>
+      <w:r>
+        <w:rPr/>
+        <w:t>202</w:t>
+      </w:r>
+      <w:r>
+        <w:rPr/>
+        <w:t>6</w:t>
+      </w:r>
+    </w:p>
     <w:p xmlns:wp14="http://schemas.microsoft.com/office/word/2010/wordml" wp14:textId="77777777">
       <w:pPr>
         <w:pStyle w:val="Normal"/>
-        <w:rPr/>
-      </w:pPr>
-      <w:r>
-        <w:rPr>
-          <w:b/>
-          <w:bCs/>
-        </w:rPr>
-        <w:t xml:space="preserve">Schema Version: </w:t>
-      </w:r>
-      <w:r>
-        <w:rPr/>
-        <w:t>1.0</w:t>
-      </w:r>
-    </w:p>
-    <w:p xmlns:wp14="http://schemas.microsoft.com/office/word/2010/wordml" wp14:textId="77777777">
-      <w:pPr>
-        <w:pStyle w:val="Normal"/>
-        <w:rPr/>
-      </w:pPr>
-      <w:r>
-        <w:rPr>
-          <w:b/>
-          <w:bCs/>
-        </w:rPr>
-        <w:t xml:space="preserve">Document Version: </w:t>
-      </w:r>
-      <w:r>
-        <w:rPr/>
-        <w:t>5.0</w:t>
-      </w:r>
-    </w:p>
-    <w:p xmlns:wp14="http://schemas.microsoft.com/office/word/2010/wordml" wp14:textId="77777777">
-      <w:pPr>
-        <w:pStyle w:val="Normal"/>
-        <w:rPr/>
-      </w:pPr>
-      <w:r>
-        <w:rPr>
-          <w:b/>
-          <w:bCs/>
-        </w:rPr>
-        <w:t xml:space="preserve">Date: </w:t>
-      </w:r>
-      <w:r>
-        <w:rPr/>
-        <w:t>November 2025</w:t>
-      </w:r>
-    </w:p>
-    <w:p xmlns:wp14="http://schemas.microsoft.com/office/word/2010/wordml" wp14:textId="77777777">
-      <w:pPr>
-        <w:pStyle w:val="Normal"/>
-      </w:pPr>
-    </w:p>
-    <w:p xmlns:wp14="http://schemas.microsoft.com/office/word/2010/wordml" wp14:textId="77777777">
-      <w:pPr>
-        <w:pStyle w:val="Normal"/>
-        <w:rPr/>
-      </w:pPr>
-      <w:r>
-        <w:rPr/>
-        <w:t>For the complete XSD schema file and example XML documents, please refer to the accompanying technical documentation.</w:t>
+      </w:pPr>
+    </w:p>
+    <w:p xmlns:wp14="http://schemas.microsoft.com/office/word/2010/wordml" wp14:textId="60B909D7">
+      <w:pPr>
+        <w:pStyle w:val="Normal"/>
+      </w:pPr>
+      <w:r>
+        <w:rPr/>
+        <w:t>XSD</w:t>
+      </w:r>
+      <w:r>
+        <w:rPr/>
+        <w:t xml:space="preserve"> schema file</w:t>
+      </w:r>
+      <w:r>
+        <w:rPr/>
+        <w:t>s</w:t>
+      </w:r>
+      <w:r>
+        <w:rPr/>
+        <w:t xml:space="preserve"> </w:t>
+      </w:r>
+      <w:r>
+        <w:rPr/>
+        <w:t>and example XML documents</w:t>
+      </w:r>
+      <w:r>
+        <w:rPr/>
+        <w:t xml:space="preserve"> are available from the following web site</w:t>
+      </w:r>
+    </w:p>
+    <w:p>
+      <w:pPr>
+        <w:pStyle w:val="Normal"/>
+      </w:pPr>
+      <w:r>
+        <w:rPr/>
+        <w:t>https://schemas.creativediversitynetwork.com/</w:t>
       </w:r>
     </w:p>
     <w:sectPr>
@@ -8056,8 +9087,8 @@
 
 <file path=word/numbering.xml><?xml version="1.0" encoding="utf-8"?>
 <w:numbering xmlns:w="http://schemas.openxmlformats.org/wordprocessingml/2006/main">
-  <w:abstractNum xmlns:w="http://schemas.openxmlformats.org/wordprocessingml/2006/main" w:abstractNumId="1">
-    <w:nsid w:val="5d8b3a28"/>
+  <w:abstractNum xmlns:w="http://schemas.openxmlformats.org/wordprocessingml/2006/main" w:abstractNumId="2">
+    <w:nsid w:val="7e8a3e3c"/>
     <w:multiLevelType xmlns:w="http://schemas.openxmlformats.org/wordprocessingml/2006/main" w:val="hybridMultilevel"/>
     <w:lvl xmlns:w="http://schemas.openxmlformats.org/wordprocessingml/2006/main" w:ilvl="0">
       <w:start w:val="1"/>
@@ -8168,6 +9199,121 @@
       </w:rPr>
     </w:lvl>
   </w:abstractNum>
+  <w:abstractNum xmlns:w="http://schemas.openxmlformats.org/wordprocessingml/2006/main" w:abstractNumId="1">
+    <w:nsid w:val="5d8b3a28"/>
+    <w:multiLevelType xmlns:w="http://schemas.openxmlformats.org/wordprocessingml/2006/main" w:val="hybridMultilevel"/>
+    <w:lvl xmlns:w="http://schemas.openxmlformats.org/wordprocessingml/2006/main" w:ilvl="0">
+      <w:start w:val="1"/>
+      <w:numFmt w:val="bullet"/>
+      <w:lvlText w:val=""/>
+      <w:lvlJc w:val="left"/>
+      <w:pPr>
+        <w:ind w:left="720" w:hanging="360"/>
+      </w:pPr>
+      <w:rPr>
+        <w:rFonts w:hint="default" w:ascii="Symbol" w:hAnsi="Symbol"/>
+      </w:rPr>
+    </w:lvl>
+    <w:lvl xmlns:w="http://schemas.openxmlformats.org/wordprocessingml/2006/main" w:ilvl="1">
+      <w:start w:val="1"/>
+      <w:numFmt w:val="bullet"/>
+      <w:lvlText w:val="o"/>
+      <w:lvlJc w:val="left"/>
+      <w:pPr>
+        <w:ind w:left="1440" w:hanging="360"/>
+      </w:pPr>
+      <w:rPr>
+        <w:rFonts w:hint="default" w:ascii="Courier New" w:hAnsi="Courier New"/>
+      </w:rPr>
+    </w:lvl>
+    <w:lvl xmlns:w="http://schemas.openxmlformats.org/wordprocessingml/2006/main" w:ilvl="2">
+      <w:start w:val="1"/>
+      <w:numFmt w:val="bullet"/>
+      <w:lvlText w:val=""/>
+      <w:lvlJc w:val="left"/>
+      <w:pPr>
+        <w:ind w:left="2160" w:hanging="360"/>
+      </w:pPr>
+      <w:rPr>
+        <w:rFonts w:hint="default" w:ascii="Wingdings" w:hAnsi="Wingdings"/>
+      </w:rPr>
+    </w:lvl>
+    <w:lvl xmlns:w="http://schemas.openxmlformats.org/wordprocessingml/2006/main" w:ilvl="3">
+      <w:start w:val="1"/>
+      <w:numFmt w:val="bullet"/>
+      <w:lvlText w:val=""/>
+      <w:lvlJc w:val="left"/>
+      <w:pPr>
+        <w:ind w:left="2880" w:hanging="360"/>
+      </w:pPr>
+      <w:rPr>
+        <w:rFonts w:hint="default" w:ascii="Symbol" w:hAnsi="Symbol"/>
+      </w:rPr>
+    </w:lvl>
+    <w:lvl xmlns:w="http://schemas.openxmlformats.org/wordprocessingml/2006/main" w:ilvl="4">
+      <w:start w:val="1"/>
+      <w:numFmt w:val="bullet"/>
+      <w:lvlText w:val="o"/>
+      <w:lvlJc w:val="left"/>
+      <w:pPr>
+        <w:ind w:left="3600" w:hanging="360"/>
+      </w:pPr>
+      <w:rPr>
+        <w:rFonts w:hint="default" w:ascii="Courier New" w:hAnsi="Courier New"/>
+      </w:rPr>
+    </w:lvl>
+    <w:lvl xmlns:w="http://schemas.openxmlformats.org/wordprocessingml/2006/main" w:ilvl="5">
+      <w:start w:val="1"/>
+      <w:numFmt w:val="bullet"/>
+      <w:lvlText w:val=""/>
+      <w:lvlJc w:val="left"/>
+      <w:pPr>
+        <w:ind w:left="4320" w:hanging="360"/>
+      </w:pPr>
+      <w:rPr>
+        <w:rFonts w:hint="default" w:ascii="Wingdings" w:hAnsi="Wingdings"/>
+      </w:rPr>
+    </w:lvl>
+    <w:lvl xmlns:w="http://schemas.openxmlformats.org/wordprocessingml/2006/main" w:ilvl="6">
+      <w:start w:val="1"/>
+      <w:numFmt w:val="bullet"/>
+      <w:lvlText w:val=""/>
+      <w:lvlJc w:val="left"/>
+      <w:pPr>
+        <w:ind w:left="5040" w:hanging="360"/>
+      </w:pPr>
+      <w:rPr>
+        <w:rFonts w:hint="default" w:ascii="Symbol" w:hAnsi="Symbol"/>
+      </w:rPr>
+    </w:lvl>
+    <w:lvl xmlns:w="http://schemas.openxmlformats.org/wordprocessingml/2006/main" w:ilvl="7">
+      <w:start w:val="1"/>
+      <w:numFmt w:val="bullet"/>
+      <w:lvlText w:val="o"/>
+      <w:lvlJc w:val="left"/>
+      <w:pPr>
+        <w:ind w:left="5760" w:hanging="360"/>
+      </w:pPr>
+      <w:rPr>
+        <w:rFonts w:hint="default" w:ascii="Courier New" w:hAnsi="Courier New"/>
+      </w:rPr>
+    </w:lvl>
+    <w:lvl xmlns:w="http://schemas.openxmlformats.org/wordprocessingml/2006/main" w:ilvl="8">
+      <w:start w:val="1"/>
+      <w:numFmt w:val="bullet"/>
+      <w:lvlText w:val=""/>
+      <w:lvlJc w:val="left"/>
+      <w:pPr>
+        <w:ind w:left="6480" w:hanging="360"/>
+      </w:pPr>
+      <w:rPr>
+        <w:rFonts w:hint="default" w:ascii="Wingdings" w:hAnsi="Wingdings"/>
+      </w:rPr>
+    </w:lvl>
+  </w:abstractNum>
+  <w:num w:numId="2">
+    <w:abstractNumId w:val="2"/>
+  </w:num>
   <w:num w:numId="1">
     <w:abstractNumId w:val="1"/>
   </w:num>

</xml_diff>

<commit_message>
Update field reference: unknown episode ID handling
v5.8: Added note on Post-TX publication ingestion behaviour
when an unknown episode ID is encountered.

Co-Authored-By: Claude Opus 4.6 <noreply@anthropic.com>
</commit_message>
<xml_diff>
--- a/docs/Diamond2_XML_Field_Reference_and_Implementation_Notes.docx
+++ b/docs/Diamond2_XML_Field_Reference_and_Implementation_Notes.docx
@@ -890,6 +890,94 @@
           </w:p>
         </w:tc>
       </w:tr>
+      <w:tr>
+        <w:trPr>
+          <w:trHeight w:val="570" w:hRule="atLeast"/>
+        </w:trPr>
+        <w:tc>
+          <w:tcPr>
+            <w:tcW w:w="1318" w:type="dxa"/>
+            <w:cnfStyle w:val="001000000000" w:firstRow="0" w:lastRow="0" w:firstColumn="1" w:lastColumn="0" w:oddVBand="0" w:evenVBand="0" w:oddHBand="0" w:evenHBand="0" w:firstRowFirstColumn="0" w:firstRowLastColumn="0" w:lastRowFirstColumn="0" w:lastRowLastColumn="0"/>
+            <w:tcBorders>
+              <w:top w:val="nil"/>
+            </w:tcBorders>
+          </w:tcPr>
+          <w:p>
+            <w:pPr>
+              <w:pStyle w:val="Normal"/>
+              <w:widowControl w:val="false"/>
+              <w:suppressAutoHyphens w:val="true"/>
+              <w:bidi w:val="0"/>
+              <w:spacing w:lineRule="auto" w:line="240"/>
+              <w:jc w:val="left"/>
+              <w:rPr>
+                <w:b w:val="false"/>
+                <w:b w:val="false"/>
+                <w:bCs w:val="false"/>
+              </w:rPr>
+            </w:pPr>
+            <w:r>
+              <w:rPr>
+                <w:b w:val="false"/>
+                <w:bCs w:val="false"/>
+              </w:rPr>
+              <w:t>5.8</w:t>
+            </w:r>
+          </w:p>
+        </w:tc>
+        <w:tc>
+          <w:tcPr>
+            <w:tcW w:w="1711" w:type="dxa"/>
+            <w:cnfStyle w:val="000000000000" w:firstRow="0" w:lastRow="0" w:firstColumn="0" w:lastColumn="0" w:oddVBand="0" w:evenVBand="0" w:oddHBand="0" w:evenHBand="0" w:firstRowFirstColumn="0" w:firstRowLastColumn="0" w:lastRowFirstColumn="0" w:lastRowLastColumn="0"/>
+            <w:tcBorders>
+              <w:top w:val="nil"/>
+            </w:tcBorders>
+          </w:tcPr>
+          <w:p>
+            <w:pPr>
+              <w:pStyle w:val="Normal"/>
+              <w:widowControl w:val="false"/>
+              <w:suppressAutoHyphens w:val="true"/>
+              <w:spacing w:lineRule="auto" w:line="240"/>
+              <w:jc w:val="left"/>
+              <w:rPr>
+                <w:sz w:val="22"/>
+              </w:rPr>
+            </w:pPr>
+            <w:r>
+              <w:rPr>
+                <w:sz w:val="22"/>
+              </w:rPr>
+              <w:t>27/6/2026</w:t>
+            </w:r>
+          </w:p>
+        </w:tc>
+        <w:tc>
+          <w:tcPr>
+            <w:tcW w:w="5986" w:type="dxa"/>
+            <w:cnfStyle w:val="000000000000" w:firstRow="0" w:lastRow="0" w:firstColumn="0" w:lastColumn="0" w:oddVBand="0" w:evenVBand="0" w:oddHBand="0" w:evenHBand="0" w:firstRowFirstColumn="0" w:firstRowLastColumn="0" w:lastRowFirstColumn="0" w:lastRowLastColumn="0"/>
+            <w:tcBorders>
+              <w:top w:val="nil"/>
+            </w:tcBorders>
+          </w:tcPr>
+          <w:p>
+            <w:pPr>
+              <w:pStyle w:val="Normal"/>
+              <w:widowControl w:val="false"/>
+              <w:suppressAutoHyphens w:val="true"/>
+              <w:spacing w:lineRule="auto" w:line="240"/>
+              <w:jc w:val="left"/>
+              <w:rPr>
+                <w:sz w:val="22"/>
+              </w:rPr>
+            </w:pPr>
+            <w:r>
+              <w:rPr/>
+              <w:t>Added note on behaviour of Post-TX publication ingestion process when an unknown Episode ID is encountered.</w:t>
+            </w:r>
+          </w:p>
+        </w:tc>
+      </w:tr>
     </w:tbl>
     <w:p>
       <w:pPr>
@@ -4126,37 +4214,223 @@
           <w:szCs w:val="22"/>
           <w:lang w:val="en-GB"/>
         </w:rPr>
-        <w:t xml:space="preserve">Mandatory reference to the episode ID from the Pre-TX metadata. Links this publication event to a specific episode. </w:t>
-      </w:r>
-      <w:r>
-        <w:rPr>
-          <w:rFonts w:eastAsia="Arial" w:cs="Arial"/>
-          <w:b/>
-          <w:bCs/>
-          <w:i w:val="false"/>
-          <w:iCs w:val="false"/>
-          <w:caps w:val="false"/>
-          <w:smallCaps w:val="false"/>
-          <w:sz w:val="22"/>
-          <w:szCs w:val="22"/>
-          <w:lang w:val="en-GB"/>
-        </w:rPr>
-        <w:t xml:space="preserve">Note: </w:t>
-      </w:r>
-      <w:r>
-        <w:rPr>
-          <w:rFonts w:eastAsia="Arial" w:cs="Arial"/>
-          <w:b w:val="false"/>
-          <w:bCs w:val="false"/>
-          <w:i w:val="false"/>
-          <w:iCs w:val="false"/>
-          <w:caps w:val="false"/>
-          <w:smallCaps w:val="false"/>
-          <w:sz w:val="22"/>
-          <w:szCs w:val="22"/>
-          <w:lang w:val="en-GB"/>
-        </w:rPr>
-        <w:t>If your transmission tracking system uses version IDs that consist of the episode ID with a suffix (e.g., episode123/01, episode123/02), you should remove the version suffix to provide just the episode ID (e.g., episode123). When removing a Publication record (i.e. remove=”true”) the episodeId attribute remains mandatory but the contents will be ignored so a hard coded empty or arbitrary value can be used.</w:t>
+        <w:t>Mandatory reference to the episode ID from the Pre-TX metadata. Links this publication event to a specific episode. When removing a Publication record (i.e. remove=”true”) the episodeId attribute remains mandatory but the contents will be ignored so a hard coded empty or arbitrary value can be used.</w:t>
+      </w:r>
+    </w:p>
+    <w:p>
+      <w:pPr>
+        <w:pStyle w:val="Normal"/>
+        <w:widowControl/>
+        <w:spacing w:before="0" w:after="0"/>
+        <w:jc w:val="left"/>
+        <w:rPr>
+          <w:lang w:val="en-GB"/>
+        </w:rPr>
+      </w:pPr>
+      <w:r>
+        <w:rPr/>
+      </w:r>
+    </w:p>
+    <w:p>
+      <w:pPr>
+        <w:pStyle w:val="Normal"/>
+        <w:widowControl/>
+        <w:spacing w:before="0" w:after="0"/>
+        <w:jc w:val="left"/>
+        <w:rPr>
+          <w:lang w:val="en-GB"/>
+        </w:rPr>
+      </w:pPr>
+      <w:r>
+        <w:rPr>
+          <w:rFonts w:eastAsia="Arial" w:cs="Arial"/>
+          <w:b/>
+          <w:bCs/>
+          <w:i w:val="false"/>
+          <w:iCs w:val="false"/>
+          <w:caps w:val="false"/>
+          <w:smallCaps w:val="false"/>
+          <w:sz w:val="22"/>
+          <w:szCs w:val="22"/>
+          <w:lang w:val="en-GB"/>
+        </w:rPr>
+        <w:t>Note</w:t>
+      </w:r>
+      <w:r>
+        <w:rPr>
+          <w:rFonts w:eastAsia="Arial" w:cs="Arial"/>
+          <w:b/>
+          <w:bCs/>
+          <w:i w:val="false"/>
+          <w:iCs w:val="false"/>
+          <w:caps w:val="false"/>
+          <w:smallCaps w:val="false"/>
+          <w:sz w:val="22"/>
+          <w:szCs w:val="22"/>
+          <w:lang w:val="en-GB"/>
+        </w:rPr>
+        <w:t>1</w:t>
+      </w:r>
+      <w:r>
+        <w:rPr>
+          <w:rFonts w:eastAsia="Arial" w:cs="Arial"/>
+          <w:b/>
+          <w:bCs/>
+          <w:i w:val="false"/>
+          <w:iCs w:val="false"/>
+          <w:caps w:val="false"/>
+          <w:smallCaps w:val="false"/>
+          <w:sz w:val="22"/>
+          <w:szCs w:val="22"/>
+          <w:lang w:val="en-GB"/>
+        </w:rPr>
+        <w:t xml:space="preserve">: </w:t>
+      </w:r>
+      <w:r>
+        <w:rPr>
+          <w:rFonts w:eastAsia="Arial" w:cs="Arial"/>
+          <w:b w:val="false"/>
+          <w:bCs w:val="false"/>
+          <w:i w:val="false"/>
+          <w:iCs w:val="false"/>
+          <w:caps w:val="false"/>
+          <w:smallCaps w:val="false"/>
+          <w:sz w:val="22"/>
+          <w:szCs w:val="22"/>
+          <w:lang w:val="en-GB"/>
+        </w:rPr>
+        <w:t>If your transmission tracking system uses version IDs that consist of the episode ID with a suffix (e.g., episode123/01, episode123/02), you should remove the version suffix to provide just the episode ID (e.g., episode123).</w:t>
+      </w:r>
+    </w:p>
+    <w:p>
+      <w:pPr>
+        <w:pStyle w:val="Normal"/>
+        <w:widowControl/>
+        <w:spacing w:before="0" w:after="0"/>
+        <w:jc w:val="left"/>
+        <w:rPr>
+          <w:lang w:val="en-GB"/>
+        </w:rPr>
+      </w:pPr>
+      <w:r>
+        <w:rPr/>
+      </w:r>
+    </w:p>
+    <w:p>
+      <w:pPr>
+        <w:pStyle w:val="Normal"/>
+        <w:widowControl/>
+        <w:spacing w:before="0" w:after="0"/>
+        <w:jc w:val="left"/>
+        <w:rPr>
+          <w:lang w:val="en-GB"/>
+        </w:rPr>
+      </w:pPr>
+      <w:r>
+        <w:rPr>
+          <w:rFonts w:eastAsia="Arial" w:cs="Arial"/>
+          <w:b/>
+          <w:bCs/>
+          <w:i w:val="false"/>
+          <w:iCs w:val="false"/>
+          <w:caps w:val="false"/>
+          <w:smallCaps w:val="false"/>
+          <w:sz w:val="22"/>
+          <w:szCs w:val="22"/>
+          <w:lang w:val="en-GB"/>
+        </w:rPr>
+        <w:t>Note2:</w:t>
+      </w:r>
+      <w:r>
+        <w:rPr>
+          <w:rFonts w:eastAsia="Arial" w:cs="Arial"/>
+          <w:b w:val="false"/>
+          <w:bCs w:val="false"/>
+          <w:i w:val="false"/>
+          <w:iCs w:val="false"/>
+          <w:caps w:val="false"/>
+          <w:smallCaps w:val="false"/>
+          <w:sz w:val="22"/>
+          <w:szCs w:val="22"/>
+          <w:lang w:val="en-GB"/>
+        </w:rPr>
+        <w:t xml:space="preserve"> If an unknown episodeId is provided this publication record will silently be ignored. This is </w:t>
+      </w:r>
+      <w:r>
+        <w:rPr>
+          <w:rFonts w:eastAsia="Arial" w:cs="Arial"/>
+          <w:b w:val="false"/>
+          <w:bCs w:val="false"/>
+          <w:i w:val="false"/>
+          <w:iCs w:val="false"/>
+          <w:caps w:val="false"/>
+          <w:smallCaps w:val="false"/>
+          <w:color w:val="auto"/>
+          <w:kern w:val="0"/>
+          <w:sz w:val="22"/>
+          <w:szCs w:val="22"/>
+          <w:lang w:val="en-GB" w:eastAsia="zh-CN" w:bidi="hi-IN"/>
+        </w:rPr>
+        <w:t>intentional. The reasoning for this is that the transmission systems delivering publication data in the Post-TX stream are often quite separate from the commissioning systems that are the source of the Pre-TX data. There are many situations where some content may not exist in the commissioning system, or may exist, but may not have been included in the Pre-TX data feed (e.g. if that content is not being monitored in Diamond). In most cases the transmission logging system will not know if the programme has been sent to Diamond or not, thus filtering out from the transmission data feed episodes that were not included in the Pre-TX data feed will be difficult or impossible. The decision was taken therefore to allow the transmission system to pass publication records for all episodes regardless of whether they were included in the Pre-TX feed, and simply ignore those records where the episdoe ID is not recognised. Obviously this means that great care needs to be taken to get the episode ID correct, since if it is wrong and thus fails to join up to the intended episode, then no error will be flagged.</w:t>
+      </w:r>
+    </w:p>
+    <w:p>
+      <w:pPr>
+        <w:pStyle w:val="Normal"/>
+        <w:widowControl/>
+        <w:spacing w:before="0" w:after="0"/>
+        <w:jc w:val="left"/>
+        <w:rPr>
+          <w:lang w:val="en-GB"/>
+        </w:rPr>
+      </w:pPr>
+      <w:r>
+        <w:rPr/>
+      </w:r>
+    </w:p>
+    <w:p>
+      <w:pPr>
+        <w:pStyle w:val="Normal"/>
+        <w:widowControl/>
+        <w:spacing w:before="0" w:after="0"/>
+        <w:jc w:val="left"/>
+        <w:rPr>
+          <w:lang w:val="en-GB"/>
+        </w:rPr>
+      </w:pPr>
+      <w:r>
+        <w:rPr>
+          <w:rFonts w:eastAsia="Arial" w:cs="Arial"/>
+          <w:b/>
+          <w:bCs/>
+          <w:i w:val="false"/>
+          <w:iCs w:val="false"/>
+          <w:caps w:val="false"/>
+          <w:smallCaps w:val="false"/>
+          <w:color w:val="auto"/>
+          <w:kern w:val="0"/>
+          <w:sz w:val="22"/>
+          <w:szCs w:val="22"/>
+          <w:lang w:val="en-GB" w:eastAsia="zh-CN" w:bidi="hi-IN"/>
+        </w:rPr>
+        <w:t>Note3:</w:t>
+      </w:r>
+      <w:r>
+        <w:rPr>
+          <w:rFonts w:eastAsia="Arial" w:cs="Arial"/>
+          <w:b w:val="false"/>
+          <w:bCs w:val="false"/>
+          <w:i w:val="false"/>
+          <w:iCs w:val="false"/>
+          <w:caps w:val="false"/>
+          <w:smallCaps w:val="false"/>
+          <w:color w:val="auto"/>
+          <w:kern w:val="0"/>
+          <w:sz w:val="22"/>
+          <w:szCs w:val="22"/>
+          <w:lang w:val="en-GB" w:eastAsia="zh-CN" w:bidi="hi-IN"/>
+        </w:rPr>
+        <w:t xml:space="preserve"> A side effect of Note2 is that the episode must have been presented in the Pre-TX XML feed, before associated transmission records are presented in the Post-TX publication feed, otherwise the publication record will be silently ignored.</w:t>
       </w:r>
     </w:p>
     <w:p>

</xml_diff>

<commit_message>
Fix minor typos in field reference documentation
Co-Authored-By: Claude Opus 4.6 <noreply@anthropic.com>
</commit_message>
<xml_diff>
--- a/docs/Diamond2_XML_Field_Reference_and_Implementation_Notes.docx
+++ b/docs/Diamond2_XML_Field_Reference_and_Implementation_Notes.docx
@@ -5915,177 +5915,6 @@
         <w:widowControl/>
         <w:spacing w:before="180" w:after="60"/>
         <w:jc w:val="left"/>
-        <w:rPr/>
-      </w:pPr>
-      <w:r>
-        <w:rPr>
-          <w:rFonts w:eastAsia="Courier New" w:cs="Courier New"/>
-          <w:b/>
-          <w:bCs/>
-          <w:i w:val="false"/>
-          <w:iCs w:val="false"/>
-          <w:caps w:val="false"/>
-          <w:smallCaps w:val="false"/>
-          <w:color w:val="0066CC"/>
-          <w:sz w:val="20"/>
-          <w:szCs w:val="20"/>
-          <w:lang w:val="en-GB"/>
-        </w:rPr>
-        <w:t>XPath: /Document/Publications/Publication/ChannelPlatforms/ChannelPlatform</w:t>
-      </w:r>
-    </w:p>
-    <w:p>
-      <w:pPr>
-        <w:pStyle w:val="Normal"/>
-        <w:widowControl/>
-        <w:spacing w:before="0" w:after="0"/>
-        <w:jc w:val="left"/>
-        <w:rPr>
-          <w:rFonts w:ascii="Arial" w:hAnsi="Arial" w:eastAsia="Arial" w:cs="Arial"/>
-          <w:b w:val="false"/>
-          <w:b w:val="false"/>
-          <w:bCs w:val="false"/>
-          <w:i w:val="false"/>
-          <w:i w:val="false"/>
-          <w:iCs w:val="false"/>
-          <w:caps w:val="false"/>
-          <w:smallCaps w:val="false"/>
-          <w:color w:val="000000" w:themeColor="accent6" w:themeShade="ff" w:themeTint="ff"/>
-          <w:sz w:val="22"/>
-          <w:szCs w:val="22"/>
-          <w:lang w:val="en-GB"/>
-        </w:rPr>
-      </w:pPr>
-      <w:r>
-        <w:rPr>
-          <w:rFonts w:eastAsia="Arial" w:cs="Arial"/>
-          <w:b/>
-          <w:bCs/>
-          <w:i w:val="false"/>
-          <w:iCs w:val="false"/>
-          <w:caps w:val="false"/>
-          <w:smallCaps w:val="false"/>
-          <w:color w:val="000000" w:themeColor="accent6" w:themeShade="ff" w:themeTint="ff"/>
-          <w:sz w:val="22"/>
-          <w:szCs w:val="22"/>
-          <w:lang w:val="en-GB"/>
-        </w:rPr>
-        <w:t xml:space="preserve">Attributes: </w:t>
-      </w:r>
-      <w:r>
-        <w:rPr>
-          <w:rFonts w:eastAsia="Arial" w:cs="Arial"/>
-          <w:b w:val="false"/>
-          <w:bCs w:val="false"/>
-          <w:i w:val="false"/>
-          <w:iCs w:val="false"/>
-          <w:caps w:val="false"/>
-          <w:smallCaps w:val="false"/>
-          <w:color w:val="000000" w:themeColor="accent6" w:themeShade="ff" w:themeTint="ff"/>
-          <w:sz w:val="22"/>
-          <w:szCs w:val="22"/>
-          <w:lang w:val="en-GB"/>
-        </w:rPr>
-        <w:t>@label (mandatory), @id (optional)</w:t>
-      </w:r>
-    </w:p>
-    <w:p>
-      <w:pPr>
-        <w:pStyle w:val="Normal"/>
-        <w:widowControl/>
-        <w:spacing w:before="0" w:after="0"/>
-        <w:jc w:val="left"/>
-        <w:rPr>
-          <w:rFonts w:ascii="Arial" w:hAnsi="Arial" w:eastAsia="Arial" w:cs="Arial"/>
-          <w:b w:val="false"/>
-          <w:b w:val="false"/>
-          <w:bCs w:val="false"/>
-          <w:i w:val="false"/>
-          <w:i w:val="false"/>
-          <w:iCs w:val="false"/>
-          <w:caps w:val="false"/>
-          <w:smallCaps w:val="false"/>
-          <w:color w:val="000000" w:themeColor="accent6" w:themeShade="ff" w:themeTint="ff"/>
-          <w:sz w:val="22"/>
-          <w:szCs w:val="22"/>
-          <w:lang w:val="en-GB"/>
-        </w:rPr>
-      </w:pPr>
-      <w:r>
-        <w:rPr>
-          <w:rFonts w:eastAsia="Arial" w:cs="Arial"/>
-          <w:b/>
-          <w:bCs/>
-          <w:i w:val="false"/>
-          <w:iCs w:val="false"/>
-          <w:caps w:val="false"/>
-          <w:smallCaps w:val="false"/>
-          <w:sz w:val="22"/>
-          <w:szCs w:val="22"/>
-          <w:lang w:val="en-GB"/>
-        </w:rPr>
-        <w:t xml:space="preserve">Description: </w:t>
-      </w:r>
-      <w:r>
-        <w:rPr>
-          <w:rFonts w:eastAsia="Arial" w:cs="Arial"/>
-          <w:b w:val="false"/>
-          <w:bCs w:val="false"/>
-          <w:i w:val="false"/>
-          <w:iCs w:val="false"/>
-          <w:caps w:val="false"/>
-          <w:smallCaps w:val="false"/>
-          <w:sz w:val="22"/>
-          <w:szCs w:val="22"/>
-          <w:lang w:val="en-GB"/>
-        </w:rPr>
-        <w:t>Represents a channel or platform on which content was published. Contains channel identification attributes and optional sub-channel child elements.</w:t>
-      </w:r>
-    </w:p>
-    <w:p>
-      <w:pPr>
-        <w:pStyle w:val="FieldName"/>
-        <w:widowControl/>
-        <w:spacing w:before="180" w:after="60"/>
-        <w:jc w:val="left"/>
-        <w:rPr>
-          <w:rFonts w:ascii="Courier New" w:hAnsi="Courier New" w:eastAsia="Courier New" w:cs="Courier New"/>
-          <w:b/>
-          <w:b/>
-          <w:bCs/>
-          <w:i w:val="false"/>
-          <w:i w:val="false"/>
-          <w:iCs w:val="false"/>
-          <w:caps w:val="false"/>
-          <w:smallCaps w:val="false"/>
-          <w:color w:val="0066CC"/>
-          <w:sz w:val="20"/>
-          <w:szCs w:val="20"/>
-          <w:lang w:val="en-GB"/>
-        </w:rPr>
-      </w:pPr>
-      <w:r>
-        <w:rPr>
-          <w:rFonts w:eastAsia="Courier New" w:cs="Courier New"/>
-          <w:b/>
-          <w:bCs/>
-          <w:i w:val="false"/>
-          <w:iCs w:val="false"/>
-          <w:caps w:val="false"/>
-          <w:smallCaps w:val="false"/>
-          <w:color w:val="0066CC"/>
-          <w:sz w:val="20"/>
-          <w:szCs w:val="20"/>
-          <w:lang w:val="en-GB"/>
-        </w:rPr>
-      </w:r>
-    </w:p>
-    <w:p>
-      <w:pPr>
-        <w:pStyle w:val="FieldName"/>
-        <w:widowControl/>
-        <w:spacing w:before="180" w:after="60"/>
-        <w:jc w:val="left"/>
         <w:rPr>
           <w:rFonts w:ascii="Arial" w:hAnsi="Arial" w:eastAsia="Arial" w:cs="Arial"/>
           <w:b/>
@@ -6604,39 +6433,6 @@
       <w:r>
         <w:rPr>
           <w:rFonts w:eastAsia="Courier New" w:cs="Courier New"/>
-          <w:b/>
-          <w:bCs/>
-          <w:i w:val="false"/>
-          <w:iCs w:val="false"/>
-          <w:caps w:val="false"/>
-          <w:smallCaps w:val="false"/>
-          <w:color w:val="0066CC"/>
-          <w:sz w:val="20"/>
-          <w:szCs w:val="20"/>
-          <w:lang w:val="en-GB"/>
-        </w:rPr>
-        <w:t>ubChannel</w:t>
-      </w:r>
-      <w:r>
-        <w:rPr>
-          <w:rFonts w:eastAsia="Courier New" w:cs="Courier New" w:ascii="Arial" w:hAnsi="Arial"/>
-          <w:b/>
-          <w:bCs/>
-          <w:i w:val="false"/>
-          <w:iCs w:val="false"/>
-          <w:caps w:val="false"/>
-          <w:smallCaps w:val="false"/>
-          <w:color w:val="0066CC"/>
-          <w:kern w:val="0"/>
-          <w:sz w:val="20"/>
-          <w:szCs w:val="20"/>
-          <w:lang w:val="en-GB" w:eastAsia="zh-CN" w:bidi="hi-IN"/>
-        </w:rPr>
-        <w:t>S</w:t>
-      </w:r>
-      <w:r>
-        <w:rPr>
-          <w:rFonts w:eastAsia="Courier New" w:cs="Courier New" w:ascii="Arial" w:hAnsi="Arial"/>
           <w:b/>
           <w:bCs/>
           <w:i w:val="false"/>

</xml_diff>